<commit_message>
Resume surgery complete: v7 content, 623 words, 1-page PDF
Cut from 1915 words (v7 import) to 623. Preserved all numbered proof points
(16 URLs, 40+, $252K, $20K, 40-hour, 32 PDFs, 359 pages, 7 proof points,
11 sources). Added subtitle, HNU degree, Nice & Precise parenthetical in
summary. Keyword pass: AI Content Senior Manager, KPIs, storytelling,
project management, schema markup. PDF is 1 page via HR-removal +
exact-line-spacing fix in export.py.

Co-Authored-By: Claude Sonnet 4.6 <noreply@anthropic.com>
</commit_message>
<xml_diff>
--- a/applications/export/Jordan_Damhof_Resume.docx
+++ b/applications/export/Jordan_Damhof_Resume.docx
@@ -5,6 +5,7 @@
     <w:p>
       <w:pPr>
         <w:pStyle w:val="Title"/>
+        <w:spacing w:line="215" w:lineRule="exact"/>
       </w:pPr>
       <w:r>
         <w:t xml:space="preserve">Jordan Damhof</w:t>
@@ -13,6 +14,7 @@
     <w:p>
       <w:pPr>
         <w:pStyle w:val="FirstParagraph"/>
+        <w:spacing w:line="215" w:lineRule="exact"/>
       </w:pPr>
       <w:r>
         <w:rPr>
@@ -25,40 +27,41 @@
     <w:p>
       <w:pPr>
         <w:pStyle w:val="BodyText"/>
-      </w:pPr>
-      <w:r>
-        <w:t xml:space="preserve">515-230-6341 · jdamhof@gmail.com · Spicer, MN · github.com/nice-and-precise · boreready.com · linkedin.com/in/jordandamhof</w:t>
-      </w:r>
-    </w:p>
-    <w:p>
-      <w:r>
-        <w:pict>
-          <v:rect style="width:0;height:1.5pt" o:hralign="center" o:hrstd="t" o:hr="t"/>
-        </w:pict>
+        <w:spacing w:line="215" w:lineRule="exact"/>
+      </w:pPr>
+      <w:r>
+        <w:t xml:space="preserve">Senior AI Content Marketing Manager | GEO-era content systems builder</w:t>
+      </w:r>
+    </w:p>
+    <w:p>
+      <w:pPr>
+        <w:pStyle w:val="BodyText"/>
+        <w:spacing w:line="215" w:lineRule="exact"/>
+      </w:pPr>
+      <w:r>
+        <w:t xml:space="preserve">515-230-6341 · jordandamhof@gmail.com · Spicer, MN · github.com/nice-and-precise · boreready.com · linkedin.com/in/jordandamhof</w:t>
       </w:r>
     </w:p>
     <w:bookmarkStart w:id="9" w:name="professional-summary"/>
     <w:p>
       <w:pPr>
         <w:pStyle w:val="Heading2"/>
-      </w:pPr>
-      <w:r>
+        <w:spacing w:before="60" w:after="20" w:line="215" w:lineRule="exact"/>
+      </w:pPr>
+      <w:r>
+        <w:rPr>
+          <w:sz w:val="24"/>
+        </w:rPr>
         <w:t xml:space="preserve">Professional Summary</w:t>
       </w:r>
     </w:p>
     <w:p>
       <w:pPr>
         <w:pStyle w:val="FirstParagraph"/>
-      </w:pPr>
-      <w:r>
-        <w:t xml:space="preserve">AI systems builder and content strategist with 20 years of experience turning complex, regulated information into structured content that people act on. Most recently: audited 16 tebra.com URLs against LLM extractability criteria (zero pages passed threshold; three template-level fixes identified) and built a Claude-native compliance-gated content pipeline from brief to published draft. Background spans B2B SaaS product development, competitive intelligence, and emergency services leadership.</w:t>
-      </w:r>
-    </w:p>
-    <w:p>
-      <w:r>
-        <w:pict>
-          <v:rect style="width:0;height:1.5pt" o:hralign="center" o:hrstd="t" o:hr="t"/>
-        </w:pict>
+        <w:spacing w:line="215" w:lineRule="exact"/>
+      </w:pPr>
+      <w:r>
+        <w:t xml:space="preserve">AI systems builder and content strategist with 20 years turning regulated information into structured BOFU content that drives pipeline. Most recently: audited 16 tebra.com URLs against LLM extractability criteria (zero pages past threshold; three fixes identified) and built a Claude-native compliance-gated pipeline from brief to draft. Background spans AI content architecture (GEO/AEO era), B2B SaaS, competitive intelligence, healthcare documentation under HIPAA, and 13 years of direct-response demand-gen ownership (Nice &amp; Precise, 2010–2023: scaled from $5,000 to $100,000–$120,000 annual revenue via Google Ads, Meta, and local SEO). Solves content operations problems requiring creative storytelling and system-level execution.</w:t>
       </w:r>
     </w:p>
     <w:bookmarkEnd w:id="9"/>
@@ -66,14 +69,19 @@
     <w:p>
       <w:pPr>
         <w:pStyle w:val="Heading2"/>
-      </w:pPr>
-      <w:r>
+        <w:spacing w:before="60" w:after="20" w:line="215" w:lineRule="exact"/>
+      </w:pPr>
+      <w:r>
+        <w:rPr>
+          <w:sz w:val="24"/>
+        </w:rPr>
         <w:t xml:space="preserve">Experience</w:t>
       </w:r>
     </w:p>
     <w:p>
       <w:pPr>
         <w:pStyle w:val="FirstParagraph"/>
+        <w:spacing w:line="215" w:lineRule="exact"/>
       </w:pPr>
       <w:r>
         <w:rPr>
@@ -86,7 +94,7 @@
         <w:t xml:space="preserve"> </w:t>
       </w:r>
       <w:r>
-        <w:t xml:space="preserve">| Founder and AI Systems Builder | 2024 -- Present</w:t>
+        <w:t xml:space="preserve">| Founder and AI Systems Builder | 2024 – Present</w:t>
       </w:r>
     </w:p>
     <w:p>
@@ -95,6 +103,7 @@
           <w:ilvl w:val="0"/>
           <w:numId w:val="1001"/>
         </w:numPr>
+        <w:spacing w:line="215" w:lineRule="exact"/>
       </w:pPr>
       <w:r>
         <w:rPr>
@@ -107,7 +116,7 @@
         <w:t xml:space="preserve"> </w:t>
       </w:r>
       <w:r>
-        <w:t xml:space="preserve">(github.com/nice-and-precise/tebra-content-os): Claude-native content pipeline for GEO-era BOFU production. Scored 16 tebra.com URLs across five LLM extractability dimensions; zero pages passed the 3.5 threshold; identified three template-level fixes that move 8 of 9 blog posts past threshold. Brief-to-draft pipeline runs compliance-hook-gated writes with registry-backed source citation; ~1,400-word BOFU comparison draft cleared the gate on first run.</w:t>
+        <w:t xml:space="preserve">(github.com/nice-and-precise/tebra-content-os): Claude-native content pipeline for GEO-era BOFU production. Scored 16 tebra.com URLs across five LLM extractability dimensions; zero pages passed the 3.5 threshold; identified three template-level fixes that move 8 of 9 blog posts past threshold. Brief-to-draft pipeline runs compliance-hook-gated writes with registry-backed source citation; ~1,400-word BOFU draft cleared the gate on first run. 7 proof points, 11 registry-backed sources.</w:t>
       </w:r>
     </w:p>
     <w:p>
@@ -116,6 +125,7 @@
           <w:ilvl w:val="0"/>
           <w:numId w:val="1001"/>
         </w:numPr>
+        <w:spacing w:line="215" w:lineRule="exact"/>
       </w:pPr>
       <w:r>
         <w:rPr>
@@ -128,7 +138,7 @@
         <w:t xml:space="preserve"> </w:t>
       </w:r>
       <w:r>
-        <w:t xml:space="preserve">(boreready.com): Two-sided B2B SaaS certification platform for underground telecom installers under Minn. Stat. § 326B.198. Authored the 8-module, 40-hour curriculum (32 PDFs, 359 pages) approved by Minnesota DLI as the statutory compliance standard. Two paying B2B clients; built on Frappe with Stripe billing, certification state machine, and immutable audit reporting.</w:t>
+        <w:t xml:space="preserve">(boreready.com): Train-the-trainer B2B SaaS platform under Minn. Stat. § 326B.198. Authored the 8-module, 40-hour curriculum (32 PDFs, 359 pages) approved by Minnesota DLI as the statutory compliance standard. Two paying B2B clients; Stripe billing, certification state machine, and audit reporting.</w:t>
       </w:r>
     </w:p>
     <w:p>
@@ -137,6 +147,7 @@
           <w:ilvl w:val="0"/>
           <w:numId w:val="1001"/>
         </w:numPr>
+        <w:spacing w:line="215" w:lineRule="exact"/>
       </w:pPr>
       <w:r>
         <w:rPr>
@@ -154,7 +165,20 @@
     </w:p>
     <w:p>
       <w:pPr>
+        <w:numPr>
+          <w:ilvl w:val="0"/>
+          <w:numId w:val="1001"/>
+        </w:numPr>
+        <w:spacing w:line="215" w:lineRule="exact"/>
+      </w:pPr>
+      <w:r>
+        <w:t xml:space="preserve">Ongoing advisory: SONAKO LLC (AI implementation), EtaP Marketing (content ops + KPIs), Midwest Underground Utilities (managed BoreReady).</w:t>
+      </w:r>
+    </w:p>
+    <w:p>
+      <w:pPr>
         <w:pStyle w:val="FirstParagraph"/>
+        <w:spacing w:line="215" w:lineRule="exact"/>
       </w:pPr>
       <w:r>
         <w:rPr>
@@ -167,7 +191,7 @@
         <w:t xml:space="preserve"> </w:t>
       </w:r>
       <w:r>
-        <w:t xml:space="preserve">| Operations and Market Intelligence Analyst | 2023 -- 2025</w:t>
+        <w:t xml:space="preserve">| Operations and Market Intelligence Analyst | 2023 – 2025</w:t>
       </w:r>
     </w:p>
     <w:p>
@@ -177,6 +201,7 @@
           <w:ilvl w:val="0"/>
           <w:numId w:val="1002"/>
         </w:numPr>
+        <w:spacing w:line="215" w:lineRule="exact"/>
       </w:pPr>
       <w:r>
         <w:t xml:space="preserve">Produced 40+ competitive intelligence battle cards: weekly briefs synthesizing competitor pricing, features, and market positioning, delivered with 1:1 sales-rep sessions to translate intelligence into active-deal talking points.</w:t>
@@ -189,14 +214,29 @@
           <w:ilvl w:val="0"/>
           <w:numId w:val="1002"/>
         </w:numPr>
-      </w:pPr>
-      <w:r>
-        <w:t xml:space="preserve">Built a custom Google Maps application that replaced dense multi-page market reports with an interactive, field-ready competitor map.</w:t>
+        <w:spacing w:line="215" w:lineRule="exact"/>
+      </w:pPr>
+      <w:r>
+        <w:t xml:space="preserve">Authored dozens of technical and operational documents per month; one rebuild resolved a $252K/year misinterpretation of manufacturing specifications – content with direct P&amp;L impact, at volume.</w:t>
+      </w:r>
+    </w:p>
+    <w:p>
+      <w:pPr>
+        <w:pStyle w:val="Compact"/>
+        <w:numPr>
+          <w:ilvl w:val="0"/>
+          <w:numId w:val="1002"/>
+        </w:numPr>
+        <w:spacing w:line="215" w:lineRule="exact"/>
+      </w:pPr>
+      <w:r>
+        <w:t xml:space="preserve">Built a custom Google Maps application replacing multi-page reports with a field-ready competitor map; led Lean Six Sigma initiatives and authored SOPs to audit-ready standards.</w:t>
       </w:r>
     </w:p>
     <w:p>
       <w:pPr>
         <w:pStyle w:val="FirstParagraph"/>
+        <w:spacing w:line="215" w:lineRule="exact"/>
       </w:pPr>
       <w:r>
         <w:rPr>
@@ -209,7 +249,7 @@
         <w:t xml:space="preserve"> </w:t>
       </w:r>
       <w:r>
-        <w:t xml:space="preserve">| Lieutenant, Shift A, Station #1 | 2006 -- 2023</w:t>
+        <w:t xml:space="preserve">| Lieutenant, Shift A, Station #1 | 2006 – 2023</w:t>
       </w:r>
     </w:p>
     <w:p>
@@ -219,9 +259,10 @@
           <w:ilvl w:val="0"/>
           <w:numId w:val="1003"/>
         </w:numPr>
-      </w:pPr>
-      <w:r>
-        <w:t xml:space="preserve">Led station operations for 7 years as Lieutenant; managed scheduling, staffing, training, performance evaluations, and compliance documentation for a full shift crew.</w:t>
+        <w:spacing w:line="215" w:lineRule="exact"/>
+      </w:pPr>
+      <w:r>
+        <w:t xml:space="preserve">Led station operations as Lieutenant for 7 years; managed scheduling, staffing, training, project management, and compliance documentation for a full shift crew.</w:t>
       </w:r>
     </w:p>
     <w:p>
@@ -231,9 +272,10 @@
           <w:ilvl w:val="0"/>
           <w:numId w:val="1003"/>
         </w:numPr>
-      </w:pPr>
-      <w:r>
-        <w:t xml:space="preserve">Developed and delivered training curriculum at the Iowa Fire Service Training Bureau (2009--2014) and Des Moines Area Community College (2013--2015); hold Instructor 1 certification.</w:t>
+        <w:spacing w:line="215" w:lineRule="exact"/>
+      </w:pPr>
+      <w:r>
+        <w:t xml:space="preserve">Authored Patient Care Reports and medical documentation under HIPAA across 17 years; audited PCRs for quality and compliance under NEMSIS data standards – the same documentation environment Tebra’s customers operate in daily.</w:t>
       </w:r>
     </w:p>
     <w:p>
@@ -243,16 +285,10 @@
           <w:ilvl w:val="0"/>
           <w:numId w:val="1003"/>
         </w:numPr>
-      </w:pPr>
-      <w:r>
-        <w:t xml:space="preserve">Authored all incident reports, inspection records, and compliance documentation to NFPA and OSHA audit standard.</w:t>
-      </w:r>
-    </w:p>
-    <w:p>
-      <w:r>
-        <w:pict>
-          <v:rect style="width:0;height:1.5pt" o:hralign="center" o:hrstd="t" o:hr="t"/>
-        </w:pict>
+        <w:spacing w:line="215" w:lineRule="exact"/>
+      </w:pPr>
+      <w:r>
+        <w:t xml:space="preserve">Developed and delivered curriculum at the Iowa Fire Service Training Bureau (2009–2014) and Des Moines Area Community College (2013–2015). Instructor 1 certification.</w:t>
       </w:r>
     </w:p>
     <w:bookmarkEnd w:id="10"/>
@@ -260,14 +296,19 @@
     <w:p>
       <w:pPr>
         <w:pStyle w:val="Heading2"/>
-      </w:pPr>
-      <w:r>
+        <w:spacing w:before="60" w:after="20" w:line="215" w:lineRule="exact"/>
+      </w:pPr>
+      <w:r>
+        <w:rPr>
+          <w:sz w:val="24"/>
+        </w:rPr>
         <w:t xml:space="preserve">Skills</w:t>
       </w:r>
     </w:p>
     <w:p>
       <w:pPr>
         <w:pStyle w:val="FirstParagraph"/>
+        <w:spacing w:line="215" w:lineRule="exact"/>
       </w:pPr>
       <w:r>
         <w:rPr>
@@ -280,30 +321,32 @@
         <w:t xml:space="preserve"> </w:t>
       </w:r>
       <w:r>
-        <w:t xml:space="preserve">Claude Code, Claude API, custom LLM prompting, prompt caching, autonomous content pipelines, compliance-hook-gated publishing, structured content for LLM extractability</w:t>
+        <w:t xml:space="preserve">Claude Code, Claude API, custom LLM prompting, AI content pipeline architecture, compliance-hook-gated publishing, structured content for LLM extractability, GEO/AEO content strategy, share-of-citation monitoring</w:t>
       </w:r>
     </w:p>
     <w:p>
       <w:pPr>
         <w:pStyle w:val="BodyText"/>
+        <w:spacing w:line="215" w:lineRule="exact"/>
       </w:pPr>
       <w:r>
         <w:rPr>
           <w:b/>
           <w:bCs/>
         </w:rPr>
-        <w:t xml:space="preserve">Content Systems:</w:t>
+        <w:t xml:space="preserve">Content Systems and Marketing:</w:t>
       </w:r>
       <w:r>
         <w:t xml:space="preserve"> </w:t>
       </w:r>
       <w:r>
-        <w:t xml:space="preserve">LLM citation auditing, BOFU asset creation, schema markup (JSON-LD: FAQPage, HowTo, Dataset), competitive intelligence, curriculum development, SOP authoring</w:t>
+        <w:t xml:space="preserve">BOFU asset creation (comparison pages, ROI calculators, case studies), LLM citation auditing, KPI tracking and reporting, storytelling, editorial workflow design, creative direction, schema markup (JSON-LD: FAQPage, HowTo), competitive intelligence, curriculum development</w:t>
       </w:r>
     </w:p>
     <w:p>
       <w:pPr>
         <w:pStyle w:val="BodyText"/>
+        <w:spacing w:line="215" w:lineRule="exact"/>
       </w:pPr>
       <w:r>
         <w:rPr>
@@ -316,50 +359,101 @@
         <w:t xml:space="preserve"> </w:t>
       </w:r>
       <w:r>
-        <w:t xml:space="preserve">Python, Frappe, Stripe API, pytest, CI/CD (GitHub Actions), GIS</w:t>
-      </w:r>
-    </w:p>
-    <w:p>
-      <w:r>
-        <w:pict>
-          <v:rect style="width:0;height:1.5pt" o:hralign="center" o:hrstd="t" o:hr="t"/>
-        </w:pict>
+        <w:t xml:space="preserve">Python, Frappe, Stripe API, pytest, CI/CD (GitHub Actions), GIS, WordPress, Google Ads, Meta Ads</w:t>
       </w:r>
     </w:p>
     <w:bookmarkEnd w:id="11"/>
-    <w:bookmarkStart w:id="12" w:name="certifications"/>
+    <w:bookmarkStart w:id="12" w:name="education"/>
     <w:p>
       <w:pPr>
         <w:pStyle w:val="Heading2"/>
-      </w:pPr>
-      <w:r>
+        <w:spacing w:before="60" w:after="20" w:line="215" w:lineRule="exact"/>
+      </w:pPr>
+      <w:r>
+        <w:rPr>
+          <w:sz w:val="24"/>
+        </w:rPr>
+        <w:t xml:space="preserve">Education</w:t>
+      </w:r>
+    </w:p>
+    <w:p>
+      <w:pPr>
+        <w:pStyle w:val="FirstParagraph"/>
+        <w:spacing w:line="215" w:lineRule="exact"/>
+      </w:pPr>
+      <w:r>
+        <w:rPr>
+          <w:b/>
+          <w:bCs/>
+        </w:rPr>
+        <w:t xml:space="preserve">Holy Names University, Oakland, CA</w:t>
+      </w:r>
+      <w:r>
+        <w:t xml:space="preserve"> </w:t>
+      </w:r>
+      <w:r>
+        <w:t xml:space="preserve">– BA, Communication Studies (2018)</w:t>
+      </w:r>
+    </w:p>
+    <w:p>
+      <w:pPr>
+        <w:pStyle w:val="BodyText"/>
+        <w:spacing w:line="215" w:lineRule="exact"/>
+      </w:pPr>
+      <w:r>
+        <w:rPr>
+          <w:b/>
+          <w:bCs/>
+        </w:rPr>
+        <w:t xml:space="preserve">Western Illinois University</w:t>
+      </w:r>
+      <w:r>
+        <w:t xml:space="preserve"> </w:t>
+      </w:r>
+      <w:r>
+        <w:t xml:space="preserve">– Fire &amp; Emergency Services Higher Education, FESHE (2012)</w:t>
+      </w:r>
+    </w:p>
+    <w:p>
+      <w:pPr>
+        <w:pStyle w:val="BodyText"/>
+        <w:spacing w:line="215" w:lineRule="exact"/>
+      </w:pPr>
+      <w:r>
+        <w:rPr>
+          <w:b/>
+          <w:bCs/>
+        </w:rPr>
+        <w:t xml:space="preserve">Hennepin Technical College, Eden Prairie, MN</w:t>
+      </w:r>
+      <w:r>
+        <w:t xml:space="preserve"> </w:t>
+      </w:r>
+      <w:r>
+        <w:t xml:space="preserve">– Fire Science and EMT (2005)</w:t>
+      </w:r>
+    </w:p>
+    <w:bookmarkEnd w:id="12"/>
+    <w:bookmarkStart w:id="13" w:name="certifications"/>
+    <w:p>
+      <w:pPr>
+        <w:pStyle w:val="Heading2"/>
+        <w:spacing w:before="60" w:after="20" w:line="215" w:lineRule="exact"/>
+      </w:pPr>
+      <w:r>
+        <w:rPr>
+          <w:sz w:val="24"/>
+        </w:rPr>
         <w:t xml:space="preserve">Certifications</w:t>
       </w:r>
     </w:p>
     <w:p>
       <w:pPr>
         <w:pStyle w:val="FirstParagraph"/>
+        <w:spacing w:line="215" w:lineRule="exact"/>
       </w:pPr>
       <w:r>
         <w:t xml:space="preserve">Fire Inspector 1 · Fire Officer 1 · Instructor 1 · Firefighter 1 and 2 · Hazmat Technician · NIMS/ICS · EMR (Iowa)</w:t>
-      </w:r>
-    </w:p>
-    <w:bookmarkEnd w:id="12"/>
-    <w:bookmarkStart w:id="13" w:name="education"/>
-    <w:p>
-      <w:pPr>
-        <w:pStyle w:val="Heading2"/>
-      </w:pPr>
-      <w:r>
-        <w:t xml:space="preserve">Education</w:t>
-      </w:r>
-    </w:p>
-    <w:p>
-      <w:pPr>
-        <w:pStyle w:val="FirstParagraph"/>
-      </w:pPr>
-      <w:r>
-        <w:t xml:space="preserve">Western Illinois University, Fire and Emergency Services Higher Education (FESHE), 2012 · College of DuPage, Fire Science Certifications, 2012 · Hennepin Technical College, Fire Science and EMT, 2005</w:t>
       </w:r>
     </w:p>
     <w:bookmarkEnd w:id="13"/>
@@ -367,7 +461,7 @@
       <w:footnotePr>
         <w:numRestart w:val="eachSect"/>
       </w:footnotePr>
-      <w:pgMar w:bottom="720" w:footer="0" w:gutter="0" w:header="0" w:left="720" w:right="720" w:top="720"/>
+      <w:pgMar w:bottom="648" w:footer="0" w:gutter="0" w:header="0" w:left="1080" w:right="1080" w:top="648"/>
     </w:sectPr>
   </w:body>
 </w:document>
@@ -804,13 +898,13 @@
     <w:pPr>
       <w:keepNext/>
       <w:keepLines/>
-      <w:spacing w:after="40" w:before="80"/>
+      <w:spacing w:after="40" w:before="100"/>
       <w:outlineLvl w:val="1"/>
     </w:pPr>
     <w:rPr>
       <w:rFonts w:asciiTheme="majorHAnsi" w:cstheme="majorBidi" w:eastAsiaTheme="majorEastAsia" w:hAnsiTheme="majorHAnsi"/>
       <w:color w:themeColor="accent1" w:themeShade="BF" w:val="0F4761"/>
-      <w:sz w:val="32"/>
+      <w:sz w:val="24"/>
       <w:szCs w:val="32"/>
     </w:rPr>
   </w:style>
@@ -827,13 +921,13 @@
     <w:pPr>
       <w:keepNext/>
       <w:keepLines/>
-      <w:spacing w:after="40" w:before="80"/>
+      <w:spacing w:after="20" w:before="60"/>
       <w:outlineLvl w:val="2"/>
     </w:pPr>
     <w:rPr>
       <w:rFonts w:cstheme="majorBidi" w:eastAsiaTheme="majorEastAsia"/>
       <w:color w:themeColor="accent1" w:themeShade="BF" w:val="0F4761"/>
-      <w:sz w:val="28"/>
+      <w:sz w:val="22"/>
       <w:szCs w:val="28"/>
     </w:rPr>
   </w:style>

</xml_diff>

<commit_message>
Retarget resume for Owner PMM CI
</commit_message>
<xml_diff>
--- a/applications/export/Jordan_Damhof_Resume.docx
+++ b/applications/export/Jordan_Damhof_Resume.docx
@@ -17,88 +17,76 @@
         <w:spacing w:line="215" w:lineRule="exact"/>
       </w:pPr>
       <w:r>
+        <w:t xml:space="preserve">Product Marketing | Competitive &amp; Market Intelligence | AI-native CI for operators</w:t>
+      </w:r>
+    </w:p>
+    <w:p>
+      <w:pPr>
+        <w:pStyle w:val="BodyText"/>
+        <w:spacing w:line="215" w:lineRule="exact"/>
+      </w:pPr>
+      <w:r>
+        <w:t xml:space="preserve">515-230-6341 · jordandamhof@gmail.com · Spicer, MN · github.com/nice-and-precise · boreready.com · linkedin.com/in/jordandamhof</w:t>
+      </w:r>
+    </w:p>
+    <w:bookmarkStart w:id="9" w:name="professional-summary"/>
+    <w:p>
+      <w:pPr>
+        <w:pStyle w:val="Heading2"/>
+        <w:spacing w:before="60" w:after="20" w:line="215" w:lineRule="exact"/>
+      </w:pPr>
+      <w:r>
+        <w:rPr>
+          <w:sz w:val="24"/>
+        </w:rPr>
+        <w:t xml:space="preserve">Professional Summary</w:t>
+      </w:r>
+    </w:p>
+    <w:p>
+      <w:pPr>
+        <w:pStyle w:val="FirstParagraph"/>
+        <w:spacing w:line="215" w:lineRule="exact"/>
+      </w:pPr>
+      <w:r>
+        <w:t xml:space="preserve">Competitive and market intelligence builder with 15+ years turning messy market evidence into proof-backed, rep-mid-call narratives for operators and sales teams. Nearly four years of AI and CI advisory; two years running a weekly competitive intelligence cadence; and hands-on restaurant operator experience as General Manager of a top-performing Domino’s Pizza flagship in a 100+ store franchise. Built battle cards, weekly briefs, scored market views, target-account playbooks, AI-assisted research workflows, and field-feedback loops.</w:t>
+      </w:r>
+    </w:p>
+    <w:bookmarkEnd w:id="9"/>
+    <w:bookmarkStart w:id="10" w:name="experience"/>
+    <w:p>
+      <w:pPr>
+        <w:pStyle w:val="Heading2"/>
+        <w:spacing w:before="60" w:after="20" w:line="215" w:lineRule="exact"/>
+      </w:pPr>
+      <w:r>
+        <w:rPr>
+          <w:sz w:val="24"/>
+        </w:rPr>
+        <w:t xml:space="preserve">Experience</w:t>
+      </w:r>
+    </w:p>
+    <w:p>
+      <w:pPr>
+        <w:pStyle w:val="FirstParagraph"/>
+        <w:spacing w:line="215" w:lineRule="exact"/>
+      </w:pPr>
+      <w:r>
         <w:rPr>
           <w:b/>
           <w:bCs/>
         </w:rPr>
-        <w:t xml:space="preserve">Jordan Damhof</w:t>
-      </w:r>
-    </w:p>
-    <w:p>
-      <w:pPr>
-        <w:pStyle w:val="BodyText"/>
-        <w:spacing w:line="215" w:lineRule="exact"/>
-      </w:pPr>
-      <w:r>
-        <w:t xml:space="preserve">Senior AI Content Marketing Manager | GEO-era content systems builder</w:t>
-      </w:r>
-    </w:p>
-    <w:p>
-      <w:pPr>
-        <w:pStyle w:val="BodyText"/>
-        <w:spacing w:line="215" w:lineRule="exact"/>
-      </w:pPr>
-      <w:r>
-        <w:t xml:space="preserve">515-230-6341 · jordandamhof@gmail.com · Spicer, MN · github.com/nice-and-precise · boreready.com · linkedin.com/in/jordandamhof</w:t>
-      </w:r>
-    </w:p>
-    <w:bookmarkStart w:id="9" w:name="professional-summary"/>
-    <w:p>
-      <w:pPr>
-        <w:pStyle w:val="Heading2"/>
-        <w:spacing w:before="60" w:after="20" w:line="215" w:lineRule="exact"/>
-      </w:pPr>
-      <w:r>
-        <w:rPr>
-          <w:sz w:val="24"/>
-        </w:rPr>
-        <w:t xml:space="preserve">Professional Summary</w:t>
-      </w:r>
-    </w:p>
-    <w:p>
-      <w:pPr>
-        <w:pStyle w:val="FirstParagraph"/>
-        <w:spacing w:line="215" w:lineRule="exact"/>
-      </w:pPr>
-      <w:r>
-        <w:t xml:space="preserve">AI systems builder and content strategist with 20 years turning regulated information into structured BOFU content that drives pipeline. Most recently: audited 16 tebra.com URLs against LLM extractability criteria (zero pages past threshold; three fixes identified) and built a Claude-native compliance-gated pipeline from brief to draft. Background spans AI content architecture (GEO/AEO era), B2B SaaS, competitive intelligence, healthcare documentation under HIPAA, and 13 years of direct-response demand-gen ownership (Nice &amp; Precise, 2010–2023: scaled from $5,000 to $100,000–$120,000 annual revenue via Google Ads, Meta, and local SEO). Solves content operations problems requiring creative storytelling and system-level execution.</w:t>
-      </w:r>
-    </w:p>
-    <w:bookmarkEnd w:id="9"/>
-    <w:bookmarkStart w:id="10" w:name="experience"/>
-    <w:p>
-      <w:pPr>
-        <w:pStyle w:val="Heading2"/>
-        <w:spacing w:before="60" w:after="20" w:line="215" w:lineRule="exact"/>
-      </w:pPr>
-      <w:r>
-        <w:rPr>
-          <w:sz w:val="24"/>
-        </w:rPr>
-        <w:t xml:space="preserve">Experience</w:t>
-      </w:r>
-    </w:p>
-    <w:p>
-      <w:pPr>
-        <w:pStyle w:val="FirstParagraph"/>
-        <w:spacing w:line="215" w:lineRule="exact"/>
-      </w:pPr>
-      <w:r>
-        <w:rPr>
-          <w:b/>
-          <w:bCs/>
-        </w:rPr>
         <w:t xml:space="preserve">Jordan Damhof Consulting</w:t>
       </w:r>
       <w:r>
         <w:t xml:space="preserve"> </w:t>
       </w:r>
       <w:r>
-        <w:t xml:space="preserve">| Founder and AI Systems Builder | 2024 – Present</w:t>
-      </w:r>
-    </w:p>
-    <w:p>
-      <w:pPr>
+        <w:t xml:space="preserve">| Founder, AI Systems &amp; Competitive Intelligence | 2022 - Present</w:t>
+      </w:r>
+    </w:p>
+    <w:p>
+      <w:pPr>
+        <w:pStyle w:val="Compact"/>
         <w:numPr>
           <w:ilvl w:val="0"/>
           <w:numId w:val="1001"/>
@@ -110,17 +98,15 @@
           <w:b/>
           <w:bCs/>
         </w:rPr>
-        <w:t xml:space="preserve">Tebra Content OS</w:t>
-      </w:r>
-      <w:r>
-        <w:t xml:space="preserve"> </w:t>
-      </w:r>
-      <w:r>
-        <w:t xml:space="preserve">(github.com/nice-and-precise/tebra-content-os): Claude-native content pipeline for GEO-era BOFU production. Scored 16 tebra.com URLs across five LLM extractability dimensions; zero pages passed the 3.5 threshold; identified three template-level fixes that move 8 of 9 blog posts past threshold. Brief-to-draft pipeline runs compliance-hook-gated writes with registry-backed source citation; ~1,400-word BOFU draft cleared the gate on first run. 7 proof points, 11 registry-backed sources.</w:t>
-      </w:r>
-    </w:p>
-    <w:p>
-      <w:pPr>
+        <w:t xml:space="preserve">Sokano</w:t>
+      </w:r>
+      <w:r>
+        <w:t xml:space="preserve">: ongoing retainer since August 2022 covering competitive and market intelligence, AI advisory, vendor evaluation, technology research, workflow automation, and process documentation. Synthesized competitor, market, pricing, and customer-segment evidence into a proof-backed source of truth for leadership briefings.</w:t>
+      </w:r>
+    </w:p>
+    <w:p>
+      <w:pPr>
+        <w:pStyle w:val="Compact"/>
         <w:numPr>
           <w:ilvl w:val="0"/>
           <w:numId w:val="1001"/>
@@ -132,21 +118,15 @@
           <w:b/>
           <w:bCs/>
         </w:rPr>
-        <w:t xml:space="preserve">BoreReady</w:t>
-      </w:r>
-      <w:r>
-        <w:t xml:space="preserve"> </w:t>
-      </w:r>
-      <w:r>
-        <w:t xml:space="preserve">(boreready.com): Train-the-trainer B2B SaaS platform under Minn. Stat. § 326B.198. Authored the 8-module, 40-hour curriculum (32 PDFs, 359 pages) approved by Minnesota DLI as the statutory compliance standard. Two paying B2B clients; Stripe billing, certification state machine, and audit reporting.</w:t>
-      </w:r>
-    </w:p>
-    <w:p>
-      <w:pPr>
-        <w:numPr>
-          <w:ilvl w:val="0"/>
-          <w:numId w:val="1001"/>
-        </w:numPr>
+        <w:t xml:space="preserve">AMIE / BoreReady</w:t>
+      </w:r>
+      <w:r>
+        <w:t xml:space="preserve">: built a semi-autonomous competitor-monitoring and AI content workflow with human-approval publishing; also shipped BoreReady, a B2B SaaS train-the-trainer platform with approved curriculum, Stripe billing, certification state machine, audit reporting, and two paying clients.</w:t>
+      </w:r>
+    </w:p>
+    <w:p>
+      <w:pPr>
+        <w:pStyle w:val="FirstParagraph"/>
         <w:spacing w:line="215" w:lineRule="exact"/>
       </w:pPr>
       <w:r>
@@ -154,44 +134,13 @@
           <w:b/>
           <w:bCs/>
         </w:rPr>
-        <w:t xml:space="preserve">AMIE</w:t>
-      </w:r>
-      <w:r>
-        <w:t xml:space="preserve"> </w:t>
-      </w:r>
-      <w:r>
-        <w:t xml:space="preserve">(Autonomous Market Intelligence Engine): Semi-autonomous competitor monitoring and AI content drafting system with human-approval publishing to WordPress, Google Business Profile, and Facebook. $20,000 engagement.</w:t>
-      </w:r>
-    </w:p>
-    <w:p>
-      <w:pPr>
-        <w:numPr>
-          <w:ilvl w:val="0"/>
-          <w:numId w:val="1001"/>
-        </w:numPr>
-        <w:spacing w:line="215" w:lineRule="exact"/>
-      </w:pPr>
-      <w:r>
-        <w:t xml:space="preserve">Ongoing advisory: SONAKO LLC (AI implementation), EtaP Marketing (content ops + KPIs), Midwest Underground Utilities (managed BoreReady).</w:t>
-      </w:r>
-    </w:p>
-    <w:p>
-      <w:pPr>
-        <w:pStyle w:val="FirstParagraph"/>
-        <w:spacing w:line="215" w:lineRule="exact"/>
-      </w:pPr>
-      <w:r>
-        <w:rPr>
-          <w:b/>
-          <w:bCs/>
-        </w:rPr>
-        <w:t xml:space="preserve">Bayer Built Woodworks</w:t>
-      </w:r>
-      <w:r>
-        <w:t xml:space="preserve"> </w:t>
-      </w:r>
-      <w:r>
-        <w:t xml:space="preserve">| Operations and Market Intelligence Analyst | 2023 – 2025</w:t>
+        <w:t xml:space="preserve">Team Honey Badger / Domino’s Pizza Franchise</w:t>
+      </w:r>
+      <w:r>
+        <w:t xml:space="preserve"> </w:t>
+      </w:r>
+      <w:r>
+        <w:t xml:space="preserve">| General Manager, Flagship Willmar MN Location | 2022 - 2023</w:t>
       </w:r>
     </w:p>
     <w:p>
@@ -204,7 +153,39 @@
         <w:spacing w:line="215" w:lineRule="exact"/>
       </w:pPr>
       <w:r>
-        <w:t xml:space="preserve">Produced 40+ competitive intelligence battle cards: weekly briefs synthesizing competitor pricing, features, and market positioning, delivered with 1:1 sales-rep sessions to translate intelligence into active-deal talking points.</w:t>
+        <w:t xml:space="preserve">Ran the franchise’s</w:t>
+      </w:r>
+      <w:r>
+        <w:t xml:space="preserve"> </w:t>
+      </w:r>
+      <w:r>
+        <w:rPr>
+          <w:b/>
+          <w:bCs/>
+        </w:rPr>
+        <w:t xml:space="preserve">flagship Willmar MN store</w:t>
+      </w:r>
+      <w:r>
+        <w:t xml:space="preserve"> </w:t>
+      </w:r>
+      <w:r>
+        <w:t xml:space="preserve">as General Manager across a 100+ location Domino’s franchise system; consistently ranked</w:t>
+      </w:r>
+      <w:r>
+        <w:t xml:space="preserve"> </w:t>
+      </w:r>
+      <w:r>
+        <w:rPr>
+          <w:b/>
+          <w:bCs/>
+        </w:rPr>
+        <w:t xml:space="preserve">top 5-10%</w:t>
+      </w:r>
+      <w:r>
+        <w:t xml:space="preserve"> </w:t>
+      </w:r>
+      <w:r>
+        <w:t xml:space="preserve">on franchise KPIs across sales, labor, food cost, and customer-experience metrics.</w:t>
       </w:r>
     </w:p>
     <w:p>
@@ -217,20 +198,7 @@
         <w:spacing w:line="215" w:lineRule="exact"/>
       </w:pPr>
       <w:r>
-        <w:t xml:space="preserve">Authored dozens of technical and operational documents per month; one rebuild resolved a $252K/year misinterpretation of manufacturing specifications – content with direct P&amp;L impact, at volume.</w:t>
-      </w:r>
-    </w:p>
-    <w:p>
-      <w:pPr>
-        <w:pStyle w:val="Compact"/>
-        <w:numPr>
-          <w:ilvl w:val="0"/>
-          <w:numId w:val="1002"/>
-        </w:numPr>
-        <w:spacing w:line="215" w:lineRule="exact"/>
-      </w:pPr>
-      <w:r>
-        <w:t xml:space="preserve">Built a custom Google Maps application replacing multi-page reports with a field-ready competitor map; led Lean Six Sigma initiatives and authored SOPs to audit-ready standards.</w:t>
+        <w:t xml:space="preserve">Owned operator realities Owner.com’s customers manage daily: POS, online ordering, delivery economics, labor, marketplaces, inventory, scheduling, driver routing, P&amp;L accountability, customer experience, and throughput.</w:t>
       </w:r>
     </w:p>
     <w:p>
@@ -243,13 +211,13 @@
           <w:b/>
           <w:bCs/>
         </w:rPr>
-        <w:t xml:space="preserve">Ames Fire Department</w:t>
-      </w:r>
-      <w:r>
-        <w:t xml:space="preserve"> </w:t>
-      </w:r>
-      <w:r>
-        <w:t xml:space="preserve">| Lieutenant, Shift A, Station #1 | 2006 – 2023</w:t>
+        <w:t xml:space="preserve">Bayer Built Woodworks</w:t>
+      </w:r>
+      <w:r>
+        <w:t xml:space="preserve"> </w:t>
+      </w:r>
+      <w:r>
+        <w:t xml:space="preserve">| Operations &amp; Market Intelligence Analyst | 2023 - 2025</w:t>
       </w:r>
     </w:p>
     <w:p>
@@ -262,7 +230,39 @@
         <w:spacing w:line="215" w:lineRule="exact"/>
       </w:pPr>
       <w:r>
-        <w:t xml:space="preserve">Led station operations as Lieutenant for 7 years; managed scheduling, staffing, training, project management, and compliance documentation for a full shift crew.</w:t>
+        <w:t xml:space="preserve">Ran a</w:t>
+      </w:r>
+      <w:r>
+        <w:t xml:space="preserve"> </w:t>
+      </w:r>
+      <w:r>
+        <w:rPr>
+          <w:b/>
+          <w:bCs/>
+        </w:rPr>
+        <w:t xml:space="preserve">weekly competitive intelligence cadence</w:t>
+      </w:r>
+      <w:r>
+        <w:t xml:space="preserve"> </w:t>
+      </w:r>
+      <w:r>
+        <w:t xml:space="preserve">(capture -&gt; analyze -&gt; publish -&gt; train -&gt; refresh) producing</w:t>
+      </w:r>
+      <w:r>
+        <w:t xml:space="preserve"> </w:t>
+      </w:r>
+      <w:r>
+        <w:rPr>
+          <w:b/>
+          <w:bCs/>
+        </w:rPr>
+        <w:t xml:space="preserve">40+ battle cards</w:t>
+      </w:r>
+      <w:r>
+        <w:t xml:space="preserve"> </w:t>
+      </w:r>
+      <w:r>
+        <w:t xml:space="preserve">and weekly market briefs on competitor pricing, features, and positioning; delivered through 1:1 rep sessions, live enablement trainings, and named-target playbooks.</w:t>
       </w:r>
     </w:p>
     <w:p>
@@ -275,7 +275,7 @@
         <w:spacing w:line="215" w:lineRule="exact"/>
       </w:pPr>
       <w:r>
-        <w:t xml:space="preserve">Authored Patient Care Reports and medical documentation under HIPAA across 17 years; audited PCRs for quality and compliance under NEMSIS data standards – the same documentation environment Tebra’s customers operate in daily.</w:t>
+        <w:t xml:space="preserve">Built repeatable sales-playbook templates after managers requested a scalable format; reps used the materials in live account conversations, brought back objection feedback, and requested more coverage.</w:t>
       </w:r>
     </w:p>
     <w:p>
@@ -288,7 +288,250 @@
         <w:spacing w:line="215" w:lineRule="exact"/>
       </w:pPr>
       <w:r>
-        <w:t xml:space="preserve">Developed and delivered curriculum at the Iowa Fire Service Training Bureau (2009–2014) and Des Moines Area Community College (2013–2015). Instructor 1 certification.</w:t>
+        <w:t xml:space="preserve">Coached reps before account calls on buyer context, competitive threats, likely objections, and talk tracks; refreshed playbooks from field feedback.</w:t>
+      </w:r>
+    </w:p>
+    <w:p>
+      <w:pPr>
+        <w:pStyle w:val="Compact"/>
+        <w:numPr>
+          <w:ilvl w:val="0"/>
+          <w:numId w:val="1003"/>
+        </w:numPr>
+        <w:spacing w:line="215" w:lineRule="exact"/>
+      </w:pPr>
+      <w:r>
+        <w:t xml:space="preserve">Authored proof-backed</w:t>
+      </w:r>
+      <w:r>
+        <w:t xml:space="preserve"> </w:t>
+      </w:r>
+      <w:r>
+        <w:rPr>
+          <w:b/>
+          <w:bCs/>
+        </w:rPr>
+        <w:t xml:space="preserve">competitive advantage reports, battle cards, and durable competitive frames</w:t>
+      </w:r>
+      <w:r>
+        <w:t xml:space="preserve"> </w:t>
+      </w:r>
+      <w:r>
+        <w:t xml:space="preserve">with inline-sourced citations and explicit</w:t>
+      </w:r>
+      <w:r>
+        <w:t xml:space="preserve"> </w:t>
+      </w:r>
+      <w:r>
+        <w:rPr>
+          <w:b/>
+          <w:bCs/>
+        </w:rPr>
+        <w:t xml:space="preserve">source-confidence tagging</w:t>
+      </w:r>
+      <w:r>
+        <w:t xml:space="preserve">.</w:t>
+      </w:r>
+    </w:p>
+    <w:p>
+      <w:pPr>
+        <w:pStyle w:val="Compact"/>
+        <w:numPr>
+          <w:ilvl w:val="0"/>
+          <w:numId w:val="1003"/>
+        </w:numPr>
+        <w:spacing w:line="215" w:lineRule="exact"/>
+      </w:pPr>
+      <w:r>
+        <w:t xml:space="preserve">Designed the</w:t>
+      </w:r>
+      <w:r>
+        <w:t xml:space="preserve"> </w:t>
+      </w:r>
+      <w:r>
+        <w:rPr>
+          <w:b/>
+          <w:bCs/>
+        </w:rPr>
+        <w:t xml:space="preserve">Expansion Strategy Playbook</w:t>
+      </w:r>
+      <w:r>
+        <w:t xml:space="preserve">: Market Assessment -&gt; Competitive Landscape -&gt; Internal Readiness -&gt; 30/60/90-day roadmap -&gt; KPIs -&gt; Go/No-Go framework -&gt; Monthly KPI Reflection.</w:t>
+      </w:r>
+    </w:p>
+    <w:p>
+      <w:pPr>
+        <w:pStyle w:val="Compact"/>
+        <w:numPr>
+          <w:ilvl w:val="0"/>
+          <w:numId w:val="1003"/>
+        </w:numPr>
+        <w:spacing w:line="215" w:lineRule="exact"/>
+      </w:pPr>
+      <w:r>
+        <w:t xml:space="preserve">Built a custom</w:t>
+      </w:r>
+      <w:r>
+        <w:t xml:space="preserve"> </w:t>
+      </w:r>
+      <w:r>
+        <w:rPr>
+          <w:b/>
+          <w:bCs/>
+        </w:rPr>
+        <w:t xml:space="preserve">Market Research GPT</w:t>
+      </w:r>
+      <w:r>
+        <w:t xml:space="preserve"> </w:t>
+      </w:r>
+      <w:r>
+        <w:t xml:space="preserve">and AppSheet database; created map-based intelligence views with categories, filters, pins, scoring, account notes, competitor tags, and priority levels.</w:t>
+      </w:r>
+    </w:p>
+    <w:p>
+      <w:pPr>
+        <w:pStyle w:val="Compact"/>
+        <w:numPr>
+          <w:ilvl w:val="0"/>
+          <w:numId w:val="1003"/>
+        </w:numPr>
+        <w:spacing w:line="215" w:lineRule="exact"/>
+      </w:pPr>
+      <w:r>
+        <w:t xml:space="preserve">Pulled from Google Maps, public websites, reviews, CRM exports, spreadsheets, news, dealer sites, social pages, and field sources; defined ICP and competitive-scoring frameworks for target-account lists, win/loss framing, and positioning.</w:t>
+      </w:r>
+    </w:p>
+    <w:p>
+      <w:pPr>
+        <w:pStyle w:val="Compact"/>
+        <w:numPr>
+          <w:ilvl w:val="0"/>
+          <w:numId w:val="1003"/>
+        </w:numPr>
+        <w:spacing w:line="215" w:lineRule="exact"/>
+      </w:pPr>
+      <w:r>
+        <w:t xml:space="preserve">Ran a</w:t>
+      </w:r>
+      <w:r>
+        <w:t xml:space="preserve"> </w:t>
+      </w:r>
+      <w:r>
+        <w:rPr>
+          <w:b/>
+          <w:bCs/>
+        </w:rPr>
+        <w:t xml:space="preserve">ChatGPT Teams enterprise rollout</w:t>
+      </w:r>
+      <w:r>
+        <w:t xml:space="preserve"> </w:t>
+      </w:r>
+      <w:r>
+        <w:t xml:space="preserve">(talking points, deck, training) and a disciplined HR Helper GPT pilot (90% accuracy threshold, kickoff, feedback loop, rollout plan).</w:t>
+      </w:r>
+    </w:p>
+    <w:p>
+      <w:pPr>
+        <w:pStyle w:val="Compact"/>
+        <w:numPr>
+          <w:ilvl w:val="0"/>
+          <w:numId w:val="1003"/>
+        </w:numPr>
+        <w:spacing w:line="215" w:lineRule="exact"/>
+      </w:pPr>
+      <w:r>
+        <w:t xml:space="preserve">One documentation rebuild resolved a</w:t>
+      </w:r>
+      <w:r>
+        <w:t xml:space="preserve"> </w:t>
+      </w:r>
+      <w:r>
+        <w:rPr>
+          <w:b/>
+          <w:bCs/>
+        </w:rPr>
+        <w:t xml:space="preserve">$252,000/year misinterpretation</w:t>
+      </w:r>
+      <w:r>
+        <w:t xml:space="preserve"> </w:t>
+      </w:r>
+      <w:r>
+        <w:t xml:space="preserve">of manufacturing specifications.</w:t>
+      </w:r>
+    </w:p>
+    <w:p>
+      <w:pPr>
+        <w:pStyle w:val="FirstParagraph"/>
+        <w:spacing w:line="215" w:lineRule="exact"/>
+      </w:pPr>
+      <w:r>
+        <w:rPr>
+          <w:b/>
+          <w:bCs/>
+        </w:rPr>
+        <w:t xml:space="preserve">Earlier Career</w:t>
+      </w:r>
+      <w:r>
+        <w:t xml:space="preserve"> </w:t>
+      </w:r>
+      <w:r>
+        <w:t xml:space="preserve">| Founder / Fire Lieutenant | 2006 - 2023</w:t>
+      </w:r>
+    </w:p>
+    <w:p>
+      <w:pPr>
+        <w:pStyle w:val="Compact"/>
+        <w:numPr>
+          <w:ilvl w:val="0"/>
+          <w:numId w:val="1004"/>
+        </w:numPr>
+        <w:spacing w:line="215" w:lineRule="exact"/>
+      </w:pPr>
+      <w:r>
+        <w:rPr>
+          <w:b/>
+          <w:bCs/>
+        </w:rPr>
+        <w:t xml:space="preserve">Nice &amp; Precise</w:t>
+      </w:r>
+      <w:r>
+        <w:t xml:space="preserve">: scaled sole-founder demand-gen agency from</w:t>
+      </w:r>
+      <w:r>
+        <w:t xml:space="preserve"> </w:t>
+      </w:r>
+      <w:r>
+        <w:rPr>
+          <w:b/>
+          <w:bCs/>
+        </w:rPr>
+        <w:t xml:space="preserve">$5,000 to $120,000</w:t>
+      </w:r>
+      <w:r>
+        <w:t xml:space="preserve"> </w:t>
+      </w:r>
+      <w:r>
+        <w:t xml:space="preserve">annual revenue across Google Ads, Meta, and local SEO.</w:t>
+      </w:r>
+    </w:p>
+    <w:p>
+      <w:pPr>
+        <w:pStyle w:val="Compact"/>
+        <w:numPr>
+          <w:ilvl w:val="0"/>
+          <w:numId w:val="1004"/>
+        </w:numPr>
+        <w:spacing w:line="215" w:lineRule="exact"/>
+      </w:pPr>
+      <w:r>
+        <w:rPr>
+          <w:b/>
+          <w:bCs/>
+        </w:rPr>
+        <w:t xml:space="preserve">Ames Fire Department</w:t>
+      </w:r>
+      <w:r>
+        <w:t xml:space="preserve">: Lieutenant for 7 years; led scheduling, staffing, training, HIPAA documentation, NEMSIS-quality audits, and curriculum delivery.</w:t>
       </w:r>
     </w:p>
     <w:bookmarkEnd w:id="10"/>
@@ -315,13 +558,25 @@
           <w:b/>
           <w:bCs/>
         </w:rPr>
-        <w:t xml:space="preserve">AI and Automation:</w:t>
-      </w:r>
-      <w:r>
-        <w:t xml:space="preserve"> </w:t>
-      </w:r>
-      <w:r>
-        <w:t xml:space="preserve">Claude Code, Claude API, custom LLM prompting, AI content pipeline architecture, compliance-hook-gated publishing, structured content for LLM extractability, GEO/AEO content strategy, share-of-citation monitoring</w:t>
+        <w:t xml:space="preserve">CI &amp; Enablement:</w:t>
+      </w:r>
+      <w:r>
+        <w:t xml:space="preserve"> </w:t>
+      </w:r>
+      <w:r>
+        <w:t xml:space="preserve">rep-mid-call battle cards, vs-sheets, objection handling, tiered sales plays, buyer-persona mapping, territory scoring, pricing/positioning tracking, proof-points backlog, win/loss definitions, RevOps/BizOps partnership, monthly</w:t>
+      </w:r>
+      <w:r>
+        <w:t xml:space="preserve"> </w:t>
+      </w:r>
+      <w:r>
+        <w:t xml:space="preserve">“what changed”</w:t>
+      </w:r>
+      <w:r>
+        <w:t xml:space="preserve"> </w:t>
+      </w:r>
+      <w:r>
+        <w:t xml:space="preserve">briefs</w:t>
       </w:r>
     </w:p>
     <w:p>
@@ -334,36 +589,17 @@
           <w:b/>
           <w:bCs/>
         </w:rPr>
-        <w:t xml:space="preserve">Content Systems and Marketing:</w:t>
-      </w:r>
-      <w:r>
-        <w:t xml:space="preserve"> </w:t>
-      </w:r>
-      <w:r>
-        <w:t xml:space="preserve">BOFU asset creation (comparison pages, ROI calculators, case studies), LLM citation auditing, KPI tracking and reporting, storytelling, editorial workflow design, creative direction, schema markup (JSON-LD: FAQPage, HowTo), competitive intelligence, curriculum development</w:t>
-      </w:r>
-    </w:p>
-    <w:p>
-      <w:pPr>
-        <w:pStyle w:val="BodyText"/>
-        <w:spacing w:line="215" w:lineRule="exact"/>
-      </w:pPr>
-      <w:r>
-        <w:rPr>
-          <w:b/>
-          <w:bCs/>
-        </w:rPr>
-        <w:t xml:space="preserve">Technical:</w:t>
-      </w:r>
-      <w:r>
-        <w:t xml:space="preserve"> </w:t>
-      </w:r>
-      <w:r>
-        <w:t xml:space="preserve">Python, Frappe, Stripe API, pytest, CI/CD (GitHub Actions), GIS, WordPress, Google Ads, Meta Ads</w:t>
+        <w:t xml:space="preserve">AI, Content &amp; Technical:</w:t>
+      </w:r>
+      <w:r>
+        <w:t xml:space="preserve"> </w:t>
+      </w:r>
+      <w:r>
+        <w:t xml:space="preserve">Anthropic, OpenAI, Gemini, NotebookLM; custom LLM prompting; agentic capture -&gt; analyze -&gt; publish pipelines; human approval gates; citation auditing; BOFU assets; KPI reporting; schema markup; Python, Frappe, Stripe API, pytest, GitHub Actions, GIS, AppSheet, HubSpot, WordPress</w:t>
       </w:r>
     </w:p>
     <w:bookmarkEnd w:id="11"/>
-    <w:bookmarkStart w:id="12" w:name="education"/>
+    <w:bookmarkStart w:id="12" w:name="education-certifications"/>
     <w:p>
       <w:pPr>
         <w:pStyle w:val="Heading2"/>
@@ -373,7 +609,7 @@
         <w:rPr>
           <w:sz w:val="24"/>
         </w:rPr>
-        <w:t xml:space="preserve">Education</w:t>
+        <w:t xml:space="preserve">Education &amp; Certifications</w:t>
       </w:r>
     </w:p>
     <w:p>
@@ -382,81 +618,10 @@
         <w:spacing w:line="215" w:lineRule="exact"/>
       </w:pPr>
       <w:r>
-        <w:rPr>
-          <w:b/>
-          <w:bCs/>
-        </w:rPr>
-        <w:t xml:space="preserve">Holy Names University, Oakland, CA</w:t>
-      </w:r>
-      <w:r>
-        <w:t xml:space="preserve"> </w:t>
-      </w:r>
-      <w:r>
-        <w:t xml:space="preserve">– BA, Communication Studies (2018)</w:t>
-      </w:r>
-    </w:p>
-    <w:p>
-      <w:pPr>
-        <w:pStyle w:val="BodyText"/>
-        <w:spacing w:line="215" w:lineRule="exact"/>
-      </w:pPr>
-      <w:r>
-        <w:rPr>
-          <w:b/>
-          <w:bCs/>
-        </w:rPr>
-        <w:t xml:space="preserve">Western Illinois University</w:t>
-      </w:r>
-      <w:r>
-        <w:t xml:space="preserve"> </w:t>
-      </w:r>
-      <w:r>
-        <w:t xml:space="preserve">– Fire &amp; Emergency Services Higher Education, FESHE (2012)</w:t>
-      </w:r>
-    </w:p>
-    <w:p>
-      <w:pPr>
-        <w:pStyle w:val="BodyText"/>
-        <w:spacing w:line="215" w:lineRule="exact"/>
-      </w:pPr>
-      <w:r>
-        <w:rPr>
-          <w:b/>
-          <w:bCs/>
-        </w:rPr>
-        <w:t xml:space="preserve">Hennepin Technical College, Eden Prairie, MN</w:t>
-      </w:r>
-      <w:r>
-        <w:t xml:space="preserve"> </w:t>
-      </w:r>
-      <w:r>
-        <w:t xml:space="preserve">– Fire Science and EMT (2005)</w:t>
+        <w:t xml:space="preserve">Western Illinois University - Fire &amp; Emergency Services Higher Education, FESHE (2012) | Hennepin Technical College - Fire Science and EMT (2005) | Fire Officer 1, Instructor 1, NIMS/ICS, EMR</w:t>
       </w:r>
     </w:p>
     <w:bookmarkEnd w:id="12"/>
-    <w:bookmarkStart w:id="13" w:name="certifications"/>
-    <w:p>
-      <w:pPr>
-        <w:pStyle w:val="Heading2"/>
-        <w:spacing w:before="60" w:after="20" w:line="215" w:lineRule="exact"/>
-      </w:pPr>
-      <w:r>
-        <w:rPr>
-          <w:sz w:val="24"/>
-        </w:rPr>
-        <w:t xml:space="preserve">Certifications</w:t>
-      </w:r>
-    </w:p>
-    <w:p>
-      <w:pPr>
-        <w:pStyle w:val="FirstParagraph"/>
-        <w:spacing w:line="215" w:lineRule="exact"/>
-      </w:pPr>
-      <w:r>
-        <w:t xml:space="preserve">Fire Inspector 1 · Fire Officer 1 · Instructor 1 · Firefighter 1 and 2 · Hazmat Technician · NIMS/ICS · EMR (Iowa)</w:t>
-      </w:r>
-    </w:p>
-    <w:bookmarkEnd w:id="13"/>
     <w:sectPr>
       <w:footnotePr>
         <w:numRestart w:val="eachSect"/>
@@ -681,6 +846,9 @@
     <w:abstractNumId w:val="991"/>
   </w:num>
   <w:num w:numId="1003">
+    <w:abstractNumId w:val="991"/>
+  </w:num>
+  <w:num w:numId="1004">
     <w:abstractNumId w:val="991"/>
   </w:num>
 </w:numbering>

</xml_diff>